<commit_message>
feat(docx): richer multi-run set_paragraph_text fidelity
Preserve first text-run rPr (not paragraph-mark) on plain text replaces,
and accept optional runs[] to clone per-run formatting when editing.

Co-authored-by: Cursor <cursoragent@cursor.com>
</commit_message>
<xml_diff>
--- a/demo/memo.docx
+++ b/demo/memo.docx
@@ -12,7 +12,16 @@
     </w:p>
     <w:p>
       <w:r>
-        <w:t>We ran a two-week pilot using Dotall for spreadsheet and document edits.</w:t>
+        <w:rPr>
+          <w:b/>
+        </w:rPr>
+        <w:t>We ran a two-week pilot</w:t>
+      </w:r>
+      <w:r>
+        <w:rPr>
+          <w:i/>
+        </w:rPr>
+        <w:t> using Dotall for spreadsheet and document edits.</w:t>
       </w:r>
     </w:p>
     <w:p>

</xml_diff>

<commit_message>
demo: apply Northstar pack verification fixes
Keep chart namespaces, PDF Priority as one field, and memo/deck geometry from the engine round-trip so inspect/read and the bake-off edits stay correct.

Co-authored-by: Cursor <cursoragent@cursor.com>
</commit_message>
<xml_diff>
--- a/demo/memo.docx
+++ b/demo/memo.docx
@@ -392,9 +392,11 @@
     </w:r>
     <w:r>
       <w:rPr>
+        <w:color w:val="595959"/>
         <w:sz w:val="16"/>
       </w:rPr>
       <w:tab/>
+      <w:t xml:space="preserve">Page </w:t>
     </w:r>
     <w:r>
       <w:rPr>
@@ -403,22 +405,8 @@
       </w:rPr>
       <w:fldChar w:fldCharType="begin"/>
       <w:instrText xml:space="preserve"> PAGE </w:instrText>
-      <w:fldChar w:fldCharType="end"/>
-    </w:r>
-    <w:r>
-      <w:rPr>
-        <w:color w:val="595959"/>
-        <w:sz w:val="16"/>
-      </w:rPr>
-      <w:t xml:space="preserve"> of </w:t>
-    </w:r>
-    <w:r>
-      <w:rPr>
-        <w:color w:val="595959"/>
-        <w:sz w:val="16"/>
-      </w:rPr>
-      <w:fldChar w:fldCharType="begin"/>
-      <w:instrText xml:space="preserve"> NUMPAGES </w:instrText>
+      <w:fldChar w:fldCharType="separate"/>
+      <w:t>1</w:t>
       <w:fldChar w:fldCharType="end"/>
     </w:r>
   </w:p>

</xml_diff>